<commit_message>
Submission package: update for Database journal - significance statement, competing interests, graphical abstract, checklist
</commit_message>
<xml_diff>
--- a/submission/significance_statement.docx
+++ b/submission/significance_statement.docx
@@ -11,79 +11,27 @@
         <w:t xml:space="preserve">Significance Statement</w:t>
       </w:r>
     </w:p>
+    <w:bookmarkEnd w:id="20"/>
     <w:p>
-      <w:pPr>
-        <w:pStyle w:val="FirstParagraph"/>
-      </w:pPr>
       <w:r>
-        <w:rPr>
-          <w:i/>
-          <w:iCs/>
-        </w:rPr>
-        <w:t xml:space="preserve">Problem:</w:t>
-      </w:r>
-      <w:r>
-        <w:t xml:space="preserve"> </w:t>
-      </w:r>
-      <w:r>
-        <w:t xml:space="preserve">Knowledge graph (KG) evaluation in gene perturbation prediction relies predominantly on single train/test splits, with no established methodology for separating the effects of graph density from domain-specific edge semantics.</w:t>
+        <w:t>Problem: Existing biological network resources for rheumatoid arthritis pain lack tissue-contextual information, pain-specific pathway organization, and systematic documentation of knowledge gaps.</w:t>
       </w:r>
     </w:p>
     <w:p>
-      <w:pPr>
-        <w:pStyle w:val="BodyText"/>
-      </w:pPr>
       <w:r>
-        <w:rPr>
-          <w:i/>
-          <w:iCs/>
-        </w:rPr>
-        <w:t xml:space="preserve">What is Known:</w:t>
-      </w:r>
-      <w:r>
-        <w:t xml:space="preserve"> </w:t>
-      </w:r>
-      <w:r>
-        <w:t xml:space="preserve">General-purpose KGs such as Gene Ontology improve perturbation prediction, but whether domain-specific KGs confer additional advantages remains unresolved.</w:t>
+        <w:t>What is Known: General-purpose resources such as PrimeKG and STRING provide broad biological coverage but do not distinguish pain-specific signaling from general inflammatory pathways. Pain-focused resources curate pain-relevant genes but lack network connectivity and multi-entity integration.</w:t>
       </w:r>
     </w:p>
     <w:p>
-      <w:pPr>
-        <w:pStyle w:val="BodyText"/>
-      </w:pPr>
       <w:r>
-        <w:rPr>
-          <w:i/>
-          <w:iCs/>
-        </w:rPr>
-        <w:t xml:space="preserve">What this Paper Adds:</w:t>
-      </w:r>
-      <w:r>
-        <w:t xml:space="preserve"> </w:t>
-      </w:r>
-      <w:r>
-        <w:t xml:space="preserve">We provide causal evidence, via a multi-split ablation benchmark of 11 KG variants, that graph connectivity—not edge identity—drives linear perturbation prediction. We document a single-split artifact where a domain KG appeared superior but the effect reversed under multi-split averaging, demonstrating that prevailing evaluation practices produce misleading conclusions. The open-source framework includes paired statistics, Kendall’s W ranking consistency, and sensitivity analyses.</w:t>
+        <w:t>What this Paper Adds: RA-PainKG, a tissue-contextualized dual-track knowledge graph integrating PrimeKG with GTEx v8 expression data and manual curation of 15 functional gene categories spanning nine pain signaling pathways. The resource includes systematic coverage-gap documentation identifying 72 core pain genes (37.5%) absent from existing biomedical knowledge graphs. All nine curated pain pathways are mapped (57-100% gene coverage), and 4,760 drug-target edges enable direct pharmacological queries.</w:t>
       </w:r>
     </w:p>
     <w:p>
-      <w:pPr>
-        <w:pStyle w:val="BodyText"/>
-      </w:pPr>
       <w:r>
-        <w:rPr>
-          <w:i/>
-          <w:iCs/>
-        </w:rPr>
-        <w:t xml:space="preserve">Who Benefits:</w:t>
-      </w:r>
-      <w:r>
-        <w:t xml:space="preserve"> </w:t>
-      </w:r>
-      <w:r>
-        <w:t xml:space="preserve">Biomedical informaticians integrating prior knowledge into machine learning pipelines, KG curators evaluating domain-specific resources, and perturbation prediction method developers seeking rigorous benchmarking standards.</w:t>
+        <w:t>Who Benefits: Pain biology researchers requiring structured, tissue-aware knowledge representations; bioinformaticians developing machine learning models with domain-specific prior knowledge; and knowledge graph curators seeking a reproducible construction framework with transparent knowledge-gap documentation.</w:t>
       </w:r>
     </w:p>
-    <w:bookmarkEnd w:id="20"/>
     <w:sectPr>
       <w:footnotePr>
         <w:numRestart w:val="eachSect"/>

</xml_diff>